<commit_message>
Add Mod 9.1 DB
</commit_message>
<xml_diff>
--- a/Module 9/Module 9.1 Discussion Board/Baldree_Mod9.1DB_CSD440.docx
+++ b/Module 9/Module 9.1 Discussion Board/Baldree_Mod9.1DB_CSD440.docx
@@ -2,6 +2,316 @@
 <file path=word/document.xml><?xml version="1.0" encoding="utf-8"?>
 <w:document xmlns:wpc="http://schemas.microsoft.com/office/word/2010/wordprocessingCanvas" xmlns:cx="http://schemas.microsoft.com/office/drawing/2014/chartex" xmlns:cx1="http://schemas.microsoft.com/office/drawing/2015/9/8/chartex" xmlns:cx2="http://schemas.microsoft.com/office/drawing/2015/10/21/chartex" xmlns:cx3="http://schemas.microsoft.com/office/drawing/2016/5/9/chartex" xmlns:cx4="http://schemas.microsoft.com/office/drawing/2016/5/10/chartex" xmlns:cx5="http://schemas.microsoft.com/office/drawing/2016/5/11/chartex" xmlns:cx6="http://schemas.microsoft.com/office/drawing/2016/5/12/chartex" xmlns:cx7="http://schemas.microsoft.com/office/drawing/2016/5/13/chartex" xmlns:cx8="http://schemas.microsoft.com/office/drawing/2016/5/14/chartex" xmlns:mc="http://schemas.openxmlformats.org/markup-compatibility/2006" xmlns:m="http://schemas.openxmlformats.org/officeDocument/2006/math" xmlns:aink="http://schemas.microsoft.com/office/drawing/2016/ink" xmlns:am3d="http://schemas.microsoft.com/office/drawing/2017/model3d" xmlns:oel="http://schemas.microsoft.com/office/2019/extlst" xmlns:r="http://schemas.openxmlformats.org/officeDocument/2006/relationships" xmlns:wp14="http://schemas.microsoft.com/office/word/2010/wordprocessingDrawing" xmlns:wp="http://schemas.openxmlformats.org/drawingml/2006/wordprocessingDrawing" xmlns:wpg="http://schemas.microsoft.com/office/word/2010/wordprocessingGroup" xmlns:wpi="http://schemas.microsoft.com/office/word/2010/wordprocessingInk" xmlns:wps="http://schemas.microsoft.com/office/word/2010/wordprocessingShape" xmlns:o="urn:schemas-microsoft-com:office:office" xmlns:v="urn:schemas-microsoft-com:vml" xmlns:w10="urn:schemas-microsoft-com:office:word" xmlns:w="http://schemas.openxmlformats.org/wordprocessingml/2006/main" xmlns:w14="http://schemas.microsoft.com/office/word/2010/wordml" xmlns:w15="http://schemas.microsoft.com/office/word/2012/wordml" xmlns:w16cex="http://schemas.microsoft.com/office/word/2018/wordml/cex" xmlns:w16cid="http://schemas.microsoft.com/office/word/2016/wordml/cid" xmlns:w16="http://schemas.microsoft.com/office/word/2018/wordml" xmlns:w16sdtdh="http://schemas.microsoft.com/office/word/2020/wordml/sdtdatahash" xmlns:w16sdtfl="http://schemas.microsoft.com/office/word/2024/wordml/sdtformatlock" xmlns:w16se="http://schemas.microsoft.com/office/word/2015/wordml/symex" xmlns:w16du="http://schemas.microsoft.com/office/word/2023/wordml/word16du" xmlns:wne="http://schemas.microsoft.com/office/word/2006/wordml" mc:Ignorable="w14 w15 w16se w16cid w16 w16cex w16sdtdh w16sdtfl w16du wp14">
   <w:body>
+    <w:p>
+      <w:pPr>
+        <w:pStyle w:val="NormalWeb"/>
+      </w:pPr>
+      <w:r>
+        <w:t>Alexander Baldree</w:t>
+      </w:r>
+    </w:p>
+    <w:p>
+      <w:pPr>
+        <w:pStyle w:val="NormalWeb"/>
+      </w:pPr>
+      <w:r>
+        <w:t>09/24/26</w:t>
+      </w:r>
+    </w:p>
+    <w:p>
+      <w:pPr>
+        <w:pStyle w:val="NormalWeb"/>
+      </w:pPr>
+      <w:r>
+        <w:t>Module 9.1 Discussion Board</w:t>
+      </w:r>
+    </w:p>
+    <w:p>
+      <w:pPr>
+        <w:pStyle w:val="NormalWeb"/>
+      </w:pPr>
+      <w:r>
+        <w:t>CSD440</w:t>
+      </w:r>
+    </w:p>
+    <w:p>
+      <w:pPr>
+        <w:pStyle w:val="NormalWeb"/>
+      </w:pPr>
+    </w:p>
+    <w:p>
+      <w:pPr>
+        <w:pStyle w:val="NormalWeb"/>
+      </w:pPr>
+      <w:r>
+        <w:t>PHP Data Objects, better known as PDO, is a feature in PHP that gives developers a consistent way to connect to and work with databases. Instead of having completely different PHP code depending on the database being used,</w:t>
+      </w:r>
+    </w:p>
+    <w:p>
+      <w:pPr>
+        <w:pStyle w:val="NormalWeb"/>
+      </w:pPr>
+      <w:r>
+        <w:t>PDO provides a common set of methods for connecting, running queries, and retrieving information. PDO has been included with PHP since PHP 5.1 and works through database-specific drivers. This means PDO handles the PHP side of the connection, while a driver such as PDO_MYSQL connects it to the actual MySQL database.</w:t>
+      </w:r>
+    </w:p>
+    <w:p>
+      <w:pPr>
+        <w:pStyle w:val="NormalWeb"/>
+      </w:pPr>
+    </w:p>
+    <w:p>
+      <w:pPr>
+        <w:pStyle w:val="NormalWeb"/>
+      </w:pPr>
+      <w:r>
+        <w:t>One of the biggest benefits I see with PDO is that it makes database code easier to work with and more flexible.</w:t>
+      </w:r>
+    </w:p>
+    <w:p>
+      <w:pPr>
+        <w:pStyle w:val="NormalWeb"/>
+      </w:pPr>
+      <w:r>
+        <w:t>PDO supports prepared statements, which allow values to be separated from the SQL query itself. This is important because prepared statements can help protect an application against SQL injection when user input is properly bound to parameters. They can also improve performance when the same query is executed several times with different information.</w:t>
+      </w:r>
+    </w:p>
+    <w:p>
+      <w:pPr>
+        <w:pStyle w:val="NormalWeb"/>
+      </w:pPr>
+    </w:p>
+    <w:p>
+      <w:pPr>
+        <w:pStyle w:val="NormalWeb"/>
+      </w:pPr>
+      <w:r>
+        <w:t>There are three main PDO classes that I would expect to work with most often. The PDO class represents the connection between PHP and the database server. The PDOStatement class represents a prepared SQL statement and the results returned after it is executed. The PDOException class is used when PDO encounters an error, such as a failed database connection. Having these different classes keeps the connection, SQL statements, and error handling separated and easier to understand.</w:t>
+      </w:r>
+    </w:p>
+    <w:p>
+      <w:pPr>
+        <w:pStyle w:val="NormalWeb"/>
+      </w:pPr>
+    </w:p>
+    <w:p>
+      <w:pPr>
+        <w:pStyle w:val="NormalWeb"/>
+      </w:pPr>
+      <w:r>
+        <w:t>Another benefit is that PDO is not limited to MySQL. PHP provides PDO drivers for databases including MySQL, PostgreSQL, SQLite, Microsoft SQL Server, Oracle, IBM DB2, Firebird, Informix, and CUBRID. Because PDO uses a similar interface between these systems, changing to another supported database can require fewer changes to the PHP code. The SQL itself may still need to be changed because PDO does not automatically translate SQL from one database system to another.</w:t>
+      </w:r>
+    </w:p>
+    <w:p>
+      <w:pPr>
+        <w:pStyle w:val="NormalWeb"/>
+      </w:pPr>
+    </w:p>
+    <w:p>
+      <w:pPr>
+        <w:pStyle w:val="NormalWeb"/>
+      </w:pPr>
+      <w:r>
+        <w:t>From working with PHP and MySQL in XAMPP, I can see how PDO would be useful when creating forms and storing customer information in a database. Instead of placing information from a form directly into an SQL statement, I could prepare the query first, bind the values, and then execute it. That makes the database code cleaner while also giving me a safer way to handle information entered by users.</w:t>
+      </w:r>
+    </w:p>
+    <w:p>
+      <w:pPr>
+        <w:pStyle w:val="NormalWeb"/>
+      </w:pPr>
+    </w:p>
+    <w:p>
+      <w:pPr>
+        <w:pStyle w:val="NormalWeb"/>
+      </w:pPr>
+      <w:r>
+        <w:t>When comparing PDO with MySQL, it is important to remember that PDO is not another database system. MySQL is the database, while PDO is one method PHP can use to communicate with it. PHP developers can also use</w:t>
+      </w:r>
+    </w:p>
+    <w:p>
+      <w:pPr>
+        <w:pStyle w:val="NormalWeb"/>
+      </w:pPr>
+      <w:r>
+        <w:t>MySQLi specifically for MySQL databases. I would lean toward PDO when building a project because it gives me the option of supporting different database systems while still providing prepared statements, error handling, and a consistent way to write database code. For a project that will only ever use MySQL, MySQLi can also handle the job, but PDO gives me more flexibility if the project changes later.</w:t>
+      </w:r>
+    </w:p>
+    <w:p>
+      <w:pPr>
+        <w:pStyle w:val="NormalWeb"/>
+      </w:pPr>
+    </w:p>
+    <w:p>
+      <w:pPr>
+        <w:pStyle w:val="NormalWeb"/>
+      </w:pPr>
+      <w:r>
+        <w:t>I have found that the reason to use PDO comes down to security, organization, and flexibility. It gives me a structured way to connect PHP applications to databases and encourages the use of prepared statements rather than putting user information directly inside SQL queries. Those features make PDO something I would want to use when developing database-driven PHP applications.</w:t>
+      </w:r>
+    </w:p>
+    <w:p>
+      <w:pPr>
+        <w:pStyle w:val="NormalWeb"/>
+      </w:pPr>
+    </w:p>
+    <w:p>
+      <w:pPr>
+        <w:pStyle w:val="NormalWeb"/>
+      </w:pPr>
+      <w:r>
+        <w:rPr>
+          <w:rStyle w:val="Strong"/>
+        </w:rPr>
+        <w:t>References:</w:t>
+      </w:r>
+    </w:p>
+    <w:p>
+      <w:pPr>
+        <w:pStyle w:val="NormalWeb"/>
+      </w:pPr>
+      <w:r>
+        <w:t xml:space="preserve">PHP Documentation Group. (n.d.). </w:t>
+      </w:r>
+      <w:r>
+        <w:rPr>
+          <w:rStyle w:val="Emphasis"/>
+        </w:rPr>
+        <w:t>PHP Data Objects (PDO).</w:t>
+      </w:r>
+      <w:r>
+        <w:t xml:space="preserve"> PHP Manual.  </w:t>
+      </w:r>
+      <w:hyperlink r:id="rId4" w:tgtFrame="_blank" w:history="1">
+        <w:r>
+          <w:rPr>
+            <w:rStyle w:val="Hyperlink"/>
+          </w:rPr>
+          <w:t>PHP Data Objects documentation</w:t>
+        </w:r>
+      </w:hyperlink>
+    </w:p>
+    <w:p>
+      <w:pPr>
+        <w:pStyle w:val="NormalWeb"/>
+      </w:pPr>
+      <w:r>
+        <w:t xml:space="preserve">PHP Documentation Group. (n.d.). </w:t>
+      </w:r>
+      <w:r>
+        <w:rPr>
+          <w:rStyle w:val="Emphasis"/>
+        </w:rPr>
+        <w:t>PDO drivers.</w:t>
+      </w:r>
+      <w:r>
+        <w:t xml:space="preserve"> PHP Manual.  </w:t>
+      </w:r>
+      <w:hyperlink r:id="rId5" w:tgtFrame="_blank" w:history="1">
+        <w:r>
+          <w:rPr>
+            <w:rStyle w:val="Hyperlink"/>
+          </w:rPr>
+          <w:t xml:space="preserve">PDO </w:t>
+        </w:r>
+        <w:proofErr w:type="gramStart"/>
+        <w:r>
+          <w:rPr>
+            <w:rStyle w:val="Hyperlink"/>
+          </w:rPr>
+          <w:t>drivers</w:t>
+        </w:r>
+        <w:proofErr w:type="gramEnd"/>
+        <w:r>
+          <w:rPr>
+            <w:rStyle w:val="Hyperlink"/>
+          </w:rPr>
+          <w:t xml:space="preserve"> documentation</w:t>
+        </w:r>
+      </w:hyperlink>
+    </w:p>
+    <w:p>
+      <w:pPr>
+        <w:pStyle w:val="NormalWeb"/>
+      </w:pPr>
+      <w:r>
+        <w:t xml:space="preserve">PHP Documentation Group. (n.d.). </w:t>
+      </w:r>
+      <w:proofErr w:type="gramStart"/>
+      <w:r>
+        <w:rPr>
+          <w:rStyle w:val="Emphasis"/>
+        </w:rPr>
+        <w:t>PDO::</w:t>
+      </w:r>
+      <w:proofErr w:type="gramEnd"/>
+      <w:r>
+        <w:rPr>
+          <w:rStyle w:val="Emphasis"/>
+        </w:rPr>
+        <w:t>prepare.</w:t>
+      </w:r>
+      <w:r>
+        <w:t xml:space="preserve"> PHP Manual.  </w:t>
+      </w:r>
+      <w:hyperlink r:id="rId6" w:tgtFrame="_blank" w:history="1">
+        <w:r>
+          <w:rPr>
+            <w:rStyle w:val="Hyperlink"/>
+          </w:rPr>
+          <w:t>PDO prepared statements documentation</w:t>
+        </w:r>
+      </w:hyperlink>
+    </w:p>
+    <w:p>
+      <w:pPr>
+        <w:pStyle w:val="NormalWeb"/>
+      </w:pPr>
+      <w:r>
+        <w:t xml:space="preserve">PHP Documentation Group. (n.d.). </w:t>
+      </w:r>
+      <w:r>
+        <w:rPr>
+          <w:rStyle w:val="Emphasis"/>
+        </w:rPr>
+        <w:t>Choosing an API.</w:t>
+      </w:r>
+      <w:r>
+        <w:t xml:space="preserve"> PHP Manual.  </w:t>
+      </w:r>
+      <w:hyperlink r:id="rId7" w:tgtFrame="_blank" w:history="1">
+        <w:r>
+          <w:rPr>
+            <w:rStyle w:val="Hyperlink"/>
+          </w:rPr>
+          <w:t>PDO and MySQLi comparison</w:t>
+        </w:r>
+      </w:hyperlink>
+    </w:p>
+    <w:p>
+      <w:pPr>
+        <w:pStyle w:val="NormalWeb"/>
+      </w:pPr>
+      <w:r>
+        <w:t xml:space="preserve">PHP Documentation Group. (n.d.). </w:t>
+      </w:r>
+      <w:r>
+        <w:rPr>
+          <w:rStyle w:val="Emphasis"/>
+        </w:rPr>
+        <w:t>PDOException.</w:t>
+      </w:r>
+      <w:r>
+        <w:t xml:space="preserve"> PHP Manual.  </w:t>
+      </w:r>
+      <w:hyperlink r:id="rId8" w:tgtFrame="_blank" w:history="1">
+        <w:r>
+          <w:rPr>
+            <w:rStyle w:val="Hyperlink"/>
+          </w:rPr>
+          <w:t>PDOException documentation</w:t>
+        </w:r>
+      </w:hyperlink>
+    </w:p>
     <w:p/>
     <w:sectPr>
       <w:pgSz w:w="12240" w:h="15840"/>
@@ -930,6 +1240,56 @@
       <w:spacing w:val="5"/>
     </w:rPr>
   </w:style>
+  <w:style w:type="paragraph" w:styleId="NormalWeb">
+    <w:name w:val="Normal (Web)"/>
+    <w:basedOn w:val="Normal"/>
+    <w:uiPriority w:val="99"/>
+    <w:semiHidden/>
+    <w:unhideWhenUsed/>
+    <w:rsid w:val="00C0511F"/>
+    <w:pPr>
+      <w:spacing w:before="100" w:beforeAutospacing="1" w:after="100" w:afterAutospacing="1" w:line="240" w:lineRule="auto"/>
+    </w:pPr>
+    <w:rPr>
+      <w:rFonts w:ascii="Times New Roman" w:eastAsia="Times New Roman" w:hAnsi="Times New Roman" w:cs="Times New Roman"/>
+      <w:kern w:val="0"/>
+      <w14:ligatures w14:val="none"/>
+    </w:rPr>
+  </w:style>
+  <w:style w:type="character" w:styleId="Strong">
+    <w:name w:val="Strong"/>
+    <w:basedOn w:val="DefaultParagraphFont"/>
+    <w:uiPriority w:val="22"/>
+    <w:qFormat/>
+    <w:rsid w:val="00C0511F"/>
+    <w:rPr>
+      <w:b/>
+      <w:bCs/>
+    </w:rPr>
+  </w:style>
+  <w:style w:type="character" w:styleId="Emphasis">
+    <w:name w:val="Emphasis"/>
+    <w:basedOn w:val="DefaultParagraphFont"/>
+    <w:uiPriority w:val="20"/>
+    <w:qFormat/>
+    <w:rsid w:val="00C0511F"/>
+    <w:rPr>
+      <w:i/>
+      <w:iCs/>
+    </w:rPr>
+  </w:style>
+  <w:style w:type="character" w:styleId="Hyperlink">
+    <w:name w:val="Hyperlink"/>
+    <w:basedOn w:val="DefaultParagraphFont"/>
+    <w:uiPriority w:val="99"/>
+    <w:semiHidden/>
+    <w:unhideWhenUsed/>
+    <w:rsid w:val="00C0511F"/>
+    <w:rPr>
+      <w:color w:val="0000FF"/>
+      <w:u w:val="single"/>
+    </w:rPr>
+  </w:style>
 </w:styles>
 </file>
 

</xml_diff>